<commit_message>
Documentação técnica e arquitetura atualizada
</commit_message>
<xml_diff>
--- a/Documents/Documentação Técnica e Arquitetural.docx
+++ b/Documents/Documentação Técnica e Arquitetural.docx
@@ -7,14 +7,27 @@
         <w:rPr>
           <w:b/>
           <w:bCs/>
-        </w:rPr>
-      </w:pPr>
-      <w:r>
-        <w:rPr>
-          <w:b/>
-          <w:bCs/>
+          <w:sz w:val="36"/>
+          <w:szCs w:val="36"/>
+        </w:rPr>
+      </w:pPr>
+      <w:r>
+        <w:rPr>
+          <w:b/>
+          <w:bCs/>
+          <w:sz w:val="36"/>
+          <w:szCs w:val="36"/>
         </w:rPr>
         <w:t>Documentação Técnica e Arquitetural</w:t>
+      </w:r>
+      <w:r>
+        <w:rPr>
+          <w:b/>
+          <w:bCs/>
+          <w:sz w:val="36"/>
+          <w:szCs w:val="36"/>
+        </w:rPr>
+        <w:t xml:space="preserve"> </w:t>
       </w:r>
     </w:p>
     <w:p>
@@ -36,57 +49,57 @@
       <w:pPr>
         <w:numPr>
           <w:ilvl w:val="0"/>
-          <w:numId w:val="1"/>
+          <w:numId w:val="4"/>
         </w:numPr>
-      </w:pPr>
-      <w:r>
-        <w:rPr>
-          <w:b/>
-          <w:bCs/>
-        </w:rPr>
-        <w:t>Nome do Sistema:</w:t>
-      </w:r>
-      <w:r>
-        <w:t xml:space="preserve"> </w:t>
-      </w:r>
-      <w:r>
-        <w:t>Estoqin</w:t>
+        <w:rPr>
+          <w:b/>
+          <w:bCs/>
+        </w:rPr>
+      </w:pPr>
+      <w:r>
+        <w:rPr>
+          <w:b/>
+          <w:bCs/>
+        </w:rPr>
+        <w:t>Nome do Sistema: Estoqin</w:t>
       </w:r>
     </w:p>
     <w:p>
       <w:pPr>
         <w:numPr>
           <w:ilvl w:val="0"/>
-          <w:numId w:val="1"/>
+          <w:numId w:val="4"/>
         </w:numPr>
-      </w:pPr>
-      <w:r>
-        <w:rPr>
-          <w:b/>
-          <w:bCs/>
-        </w:rPr>
-        <w:t>Objetivo:</w:t>
-      </w:r>
-      <w:r>
-        <w:t xml:space="preserve"> Gestão e controle de estoque de bebidas focado no rastreamento de lotes e prevenção de perdas por validade, com margem de alerta personalizada por produto.</w:t>
+        <w:rPr>
+          <w:b/>
+          <w:bCs/>
+        </w:rPr>
+      </w:pPr>
+      <w:r>
+        <w:rPr>
+          <w:b/>
+          <w:bCs/>
+        </w:rPr>
+        <w:t>Objetivo: Gestão e controle de estoque de bebidas focado no rastreamento de lotes e prevenção de perdas por validade, com margem de alerta personalizada por produto.</w:t>
       </w:r>
     </w:p>
     <w:p>
       <w:pPr>
         <w:numPr>
           <w:ilvl w:val="0"/>
-          <w:numId w:val="1"/>
+          <w:numId w:val="4"/>
         </w:numPr>
-      </w:pPr>
-      <w:r>
-        <w:rPr>
-          <w:b/>
-          <w:bCs/>
-        </w:rPr>
-        <w:t>Paradigma de Desenvolvimento:</w:t>
-      </w:r>
-      <w:r>
-        <w:t xml:space="preserve"> Separação total em duas camadas (Backend e Frontend) comunicando-se via REST/HTTP.</w:t>
+        <w:rPr>
+          <w:b/>
+          <w:bCs/>
+        </w:rPr>
+      </w:pPr>
+      <w:r>
+        <w:rPr>
+          <w:b/>
+          <w:bCs/>
+        </w:rPr>
+        <w:t>Paradigma de Desenvolvimento: Separação total em duas camadas (Backend e Frontend Web) comunicando-se via REST/HTTP (Arquitetura Cliente-Servidor desacoplada).</w:t>
       </w:r>
     </w:p>
     <w:p>
@@ -105,42 +118,100 @@
       </w:r>
     </w:p>
     <w:p>
-      <w:r>
-        <w:t>[ Aplicação Desktop (WPF) ]</w:t>
+      <w:pPr>
+        <w:rPr>
+          <w:b/>
+          <w:bCs/>
+        </w:rPr>
+      </w:pPr>
+      <w:r>
+        <w:rPr>
+          <w:b/>
+          <w:bCs/>
+        </w:rPr>
+        <w:t>[ Interface Web (React + TypeScript) ]</w:t>
       </w:r>
     </w:p>
     <w:p>
-      <w:r>
-        <w:t xml:space="preserve">         │</w:t>
+      <w:pPr>
+        <w:rPr>
+          <w:b/>
+          <w:bCs/>
+        </w:rPr>
+      </w:pPr>
+      <w:r>
+        <w:rPr>
+          <w:b/>
+          <w:bCs/>
+        </w:rPr>
+        <w:t xml:space="preserve">                 │</w:t>
       </w:r>
     </w:p>
     <w:p>
-      <w:r>
-        <w:t xml:space="preserve">         │  Requisições HTTP / JSON (HttpClient)</w:t>
+      <w:pPr>
+        <w:rPr>
+          <w:b/>
+          <w:bCs/>
+        </w:rPr>
+      </w:pPr>
+      <w:r>
+        <w:rPr>
+          <w:b/>
+          <w:bCs/>
+        </w:rPr>
+        <w:t xml:space="preserve">                 │  Requisições HTTP / JSON (Axios / REST API)</w:t>
       </w:r>
     </w:p>
     <w:p>
-      <w:r>
-        <w:t xml:space="preserve">         </w:t>
+      <w:pPr>
+        <w:rPr>
+          <w:b/>
+          <w:bCs/>
+        </w:rPr>
+      </w:pPr>
+      <w:r>
+        <w:rPr>
+          <w:b/>
+          <w:bCs/>
+        </w:rPr>
+        <w:t xml:space="preserve">                 </w:t>
       </w:r>
       <w:r>
         <w:rPr>
           <w:rFonts w:ascii="Arial" w:hAnsi="Arial" w:cs="Arial"/>
+          <w:b/>
+          <w:bCs/>
         </w:rPr>
         <w:t>▼</w:t>
       </w:r>
     </w:p>
     <w:p>
-      <w:r>
+      <w:pPr>
+        <w:rPr>
+          <w:b/>
+          <w:bCs/>
+        </w:rPr>
+      </w:pPr>
+      <w:r>
+        <w:rPr>
+          <w:b/>
+          <w:bCs/>
+        </w:rPr>
         <w:t>[ Web API (ASP.NET Core) ] ── (EF Core) ──</w:t>
       </w:r>
       <w:r>
         <w:rPr>
           <w:rFonts w:ascii="Arial" w:hAnsi="Arial" w:cs="Arial"/>
+          <w:b/>
+          <w:bCs/>
         </w:rPr>
         <w:t>►</w:t>
       </w:r>
       <w:r>
+        <w:rPr>
+          <w:b/>
+          <w:bCs/>
+        </w:rPr>
         <w:t xml:space="preserve"> [ Banco de Dados (SQLite) ]</w:t>
       </w:r>
     </w:p>
@@ -148,36 +219,38 @@
       <w:pPr>
         <w:numPr>
           <w:ilvl w:val="0"/>
-          <w:numId w:val="2"/>
+          <w:numId w:val="5"/>
         </w:numPr>
-      </w:pPr>
-      <w:r>
-        <w:rPr>
-          <w:b/>
-          <w:bCs/>
-        </w:rPr>
-        <w:t>Backend (Camada de Serviços e Dados):</w:t>
-      </w:r>
-      <w:r>
-        <w:t xml:space="preserve"> Responsável por isolar as regras de negócio, persistência de dados, cálculos de datas de vencimento e exposição dos endpoints HTTP.</w:t>
+        <w:rPr>
+          <w:b/>
+          <w:bCs/>
+        </w:rPr>
+      </w:pPr>
+      <w:r>
+        <w:rPr>
+          <w:b/>
+          <w:bCs/>
+        </w:rPr>
+        <w:t>Backend (Camada de Serviços e Dados): Responsável por isolar as regras de negócio, autenticação/autorização, persistência de dados, cálculos de datas de vencimento e exposição dos endpoints HTTP RESTful.</w:t>
       </w:r>
     </w:p>
     <w:p>
       <w:pPr>
         <w:numPr>
           <w:ilvl w:val="0"/>
-          <w:numId w:val="2"/>
+          <w:numId w:val="5"/>
         </w:numPr>
-      </w:pPr>
-      <w:r>
-        <w:rPr>
-          <w:b/>
-          <w:bCs/>
-        </w:rPr>
-        <w:t>Frontend (Camada de Apresentação):</w:t>
-      </w:r>
-      <w:r>
-        <w:t xml:space="preserve"> Interface gráfica desktop interativa, reativa ao estado dos dados (MVVM), sem acesso direto ao banco de dados.</w:t>
+        <w:rPr>
+          <w:b/>
+          <w:bCs/>
+        </w:rPr>
+      </w:pPr>
+      <w:r>
+        <w:rPr>
+          <w:b/>
+          <w:bCs/>
+        </w:rPr>
+        <w:t>Frontend Web (Camada de Apresentação): Interface gráfica Web reativa e responsiva (Single Page Application - SPA) rodando diretamente no navegador, responsável pela experiência do usuário e pelo consumo da API, sem acesso direto ao banco de dados.</w:t>
       </w:r>
     </w:p>
     <w:p>
@@ -208,9 +281,9 @@
         <w:tblLook w:val="04A0" w:firstRow="1" w:lastRow="0" w:firstColumn="1" w:lastColumn="0" w:noHBand="0" w:noVBand="1"/>
       </w:tblPr>
       <w:tblGrid>
-        <w:gridCol w:w="1954"/>
-        <w:gridCol w:w="3375"/>
-        <w:gridCol w:w="3159"/>
+        <w:gridCol w:w="1987"/>
+        <w:gridCol w:w="1894"/>
+        <w:gridCol w:w="4607"/>
       </w:tblGrid>
       <w:tr>
         <w:trPr>
@@ -236,6 +309,12 @@
             <w:hideMark/>
           </w:tcPr>
           <w:p>
+            <w:pPr>
+              <w:rPr>
+                <w:b/>
+                <w:bCs/>
+              </w:rPr>
+            </w:pPr>
             <w:r>
               <w:rPr>
                 <w:b/>
@@ -264,6 +343,12 @@
             <w:hideMark/>
           </w:tcPr>
           <w:p>
+            <w:pPr>
+              <w:rPr>
+                <w:b/>
+                <w:bCs/>
+              </w:rPr>
+            </w:pPr>
             <w:r>
               <w:rPr>
                 <w:b/>
@@ -292,6 +377,12 @@
             <w:hideMark/>
           </w:tcPr>
           <w:p>
+            <w:pPr>
+              <w:rPr>
+                <w:b/>
+                <w:bCs/>
+              </w:rPr>
+            </w:pPr>
             <w:r>
               <w:rPr>
                 <w:b/>
@@ -325,6 +416,12 @@
             <w:hideMark/>
           </w:tcPr>
           <w:p>
+            <w:pPr>
+              <w:rPr>
+                <w:b/>
+                <w:bCs/>
+              </w:rPr>
+            </w:pPr>
             <w:r>
               <w:rPr>
                 <w:b/>
@@ -353,7 +450,17 @@
             <w:hideMark/>
           </w:tcPr>
           <w:p>
+            <w:pPr>
+              <w:rPr>
+                <w:b/>
+                <w:bCs/>
+              </w:rPr>
+            </w:pPr>
             <w:r>
+              <w:rPr>
+                <w:b/>
+                <w:bCs/>
+              </w:rPr>
               <w:t>.NET 8 (LTS)</w:t>
             </w:r>
           </w:p>
@@ -377,8 +484,18 @@
             <w:hideMark/>
           </w:tcPr>
           <w:p>
+            <w:pPr>
+              <w:rPr>
+                <w:b/>
+                <w:bCs/>
+              </w:rPr>
+            </w:pPr>
             <w:r>
-              <w:t>Framework de desenvolvimento unificado e de alta performance.</w:t>
+              <w:rPr>
+                <w:b/>
+                <w:bCs/>
+              </w:rPr>
+              <w:t>Framework de desenvolvimento unificado e de alta performance para o servidor.</w:t>
             </w:r>
           </w:p>
         </w:tc>
@@ -406,11 +523,18 @@
             <w:hideMark/>
           </w:tcPr>
           <w:p>
+            <w:pPr>
+              <w:rPr>
+                <w:b/>
+                <w:bCs/>
+              </w:rPr>
+            </w:pPr>
             <w:r>
               <w:rPr>
                 <w:b/>
                 <w:bCs/>
               </w:rPr>
+              <w:lastRenderedPageBreak/>
               <w:t>Backend API</w:t>
             </w:r>
           </w:p>
@@ -436,11 +560,15 @@
           <w:p>
             <w:pPr>
               <w:rPr>
+                <w:b/>
+                <w:bCs/>
                 <w:lang w:val="en-US"/>
               </w:rPr>
             </w:pPr>
             <w:r>
               <w:rPr>
+                <w:b/>
+                <w:bCs/>
                 <w:lang w:val="en-US"/>
               </w:rPr>
               <w:t>ASP.NET Core Web API</w:t>
@@ -466,8 +594,18 @@
             <w:hideMark/>
           </w:tcPr>
           <w:p>
+            <w:pPr>
+              <w:rPr>
+                <w:b/>
+                <w:bCs/>
+              </w:rPr>
+            </w:pPr>
             <w:r>
-              <w:t>Construção da API RESTful com rotas e documentação Swagger.</w:t>
+              <w:rPr>
+                <w:b/>
+                <w:bCs/>
+              </w:rPr>
+              <w:t>Construção da API RESTful com rotas, controladores, autenticação JWT e documentação interativa via Swagger.</w:t>
             </w:r>
           </w:p>
         </w:tc>
@@ -495,13 +633,18 @@
             <w:hideMark/>
           </w:tcPr>
           <w:p>
+            <w:pPr>
+              <w:rPr>
+                <w:b/>
+                <w:bCs/>
+              </w:rPr>
+            </w:pPr>
             <w:r>
               <w:rPr>
                 <w:b/>
                 <w:bCs/>
               </w:rPr>
-              <w:lastRenderedPageBreak/>
-              <w:t>Frontend Desktop</w:t>
+              <w:t>Frontend Web</w:t>
             </w:r>
           </w:p>
         </w:tc>
@@ -524,8 +667,18 @@
             <w:hideMark/>
           </w:tcPr>
           <w:p>
+            <w:pPr>
+              <w:rPr>
+                <w:b/>
+                <w:bCs/>
+              </w:rPr>
+            </w:pPr>
             <w:r>
-              <w:t>WPF (Windows Presentation Foundation)</w:t>
+              <w:rPr>
+                <w:b/>
+                <w:bCs/>
+              </w:rPr>
+              <w:t>React + TypeScript (Vite)</w:t>
             </w:r>
           </w:p>
         </w:tc>
@@ -548,8 +701,18 @@
             <w:hideMark/>
           </w:tcPr>
           <w:p>
+            <w:pPr>
+              <w:rPr>
+                <w:b/>
+                <w:bCs/>
+              </w:rPr>
+            </w:pPr>
             <w:r>
-              <w:t>Interface rica com XAML para ambiente desktop Windows.</w:t>
+              <w:rPr>
+                <w:b/>
+                <w:bCs/>
+              </w:rPr>
+              <w:t>Biblioteca para construção de interfaces reativas em SPA com tipagem estrita de dados.</w:t>
             </w:r>
           </w:p>
         </w:tc>
@@ -577,12 +740,18 @@
             <w:hideMark/>
           </w:tcPr>
           <w:p>
+            <w:pPr>
+              <w:rPr>
+                <w:b/>
+                <w:bCs/>
+              </w:rPr>
+            </w:pPr>
             <w:r>
               <w:rPr>
                 <w:b/>
                 <w:bCs/>
               </w:rPr>
-              <w:t>Padrão do Frontend</w:t>
+              <w:t>Estilização / UI</w:t>
             </w:r>
           </w:p>
         </w:tc>
@@ -605,8 +774,18 @@
             <w:hideMark/>
           </w:tcPr>
           <w:p>
+            <w:pPr>
+              <w:rPr>
+                <w:b/>
+                <w:bCs/>
+              </w:rPr>
+            </w:pPr>
             <w:r>
-              <w:t>MVVM (CommunityToolkit.Mvvm)</w:t>
+              <w:rPr>
+                <w:b/>
+                <w:bCs/>
+              </w:rPr>
+              <w:t>Tailwind CSS</w:t>
             </w:r>
           </w:p>
         </w:tc>
@@ -629,18 +808,18 @@
             <w:hideMark/>
           </w:tcPr>
           <w:p>
+            <w:pPr>
+              <w:rPr>
+                <w:b/>
+                <w:bCs/>
+              </w:rPr>
+            </w:pPr>
             <w:r>
-              <w:t xml:space="preserve">Desacoplamento entre interface e lógica via </w:t>
-            </w:r>
-            <w:r>
-              <w:rPr>
-                <w:i/>
-                <w:iCs/>
-              </w:rPr>
-              <w:t>Data Binding</w:t>
-            </w:r>
-            <w:r>
-              <w:t>.</w:t>
+              <w:rPr>
+                <w:b/>
+                <w:bCs/>
+              </w:rPr>
+              <w:t>Framework CSS utilitário para construção de dashboards e interfaces modernas e responsivas.</w:t>
             </w:r>
           </w:p>
         </w:tc>
@@ -668,6 +847,12 @@
             <w:hideMark/>
           </w:tcPr>
           <w:p>
+            <w:pPr>
+              <w:rPr>
+                <w:b/>
+                <w:bCs/>
+              </w:rPr>
+            </w:pPr>
             <w:r>
               <w:rPr>
                 <w:b/>
@@ -696,7 +881,17 @@
             <w:hideMark/>
           </w:tcPr>
           <w:p>
+            <w:pPr>
+              <w:rPr>
+                <w:b/>
+                <w:bCs/>
+              </w:rPr>
+            </w:pPr>
             <w:r>
+              <w:rPr>
+                <w:b/>
+                <w:bCs/>
+              </w:rPr>
               <w:t>Entity Framework Core</w:t>
             </w:r>
           </w:p>
@@ -720,17 +915,33 @@
             <w:hideMark/>
           </w:tcPr>
           <w:p>
+            <w:pPr>
+              <w:rPr>
+                <w:b/>
+                <w:bCs/>
+              </w:rPr>
+            </w:pPr>
             <w:r>
-              <w:t>Abstração e controle do banco de dados via C# (</w:t>
+              <w:rPr>
+                <w:b/>
+                <w:bCs/>
+              </w:rPr>
+              <w:t>Abstração e controle do banco de dados relacional via C# (</w:t>
             </w:r>
             <w:r>
               <w:rPr>
+                <w:b/>
+                <w:bCs/>
                 <w:i/>
                 <w:iCs/>
               </w:rPr>
               <w:t>Code-First</w:t>
             </w:r>
             <w:r>
+              <w:rPr>
+                <w:b/>
+                <w:bCs/>
+              </w:rPr>
               <w:t>).</w:t>
             </w:r>
           </w:p>
@@ -759,6 +970,12 @@
             <w:hideMark/>
           </w:tcPr>
           <w:p>
+            <w:pPr>
+              <w:rPr>
+                <w:b/>
+                <w:bCs/>
+              </w:rPr>
+            </w:pPr>
             <w:r>
               <w:rPr>
                 <w:b/>
@@ -787,7 +1004,17 @@
             <w:hideMark/>
           </w:tcPr>
           <w:p>
+            <w:pPr>
+              <w:rPr>
+                <w:b/>
+                <w:bCs/>
+              </w:rPr>
+            </w:pPr>
             <w:r>
+              <w:rPr>
+                <w:b/>
+                <w:bCs/>
+              </w:rPr>
               <w:t>SQLite</w:t>
             </w:r>
           </w:p>
@@ -811,8 +1038,18 @@
             <w:hideMark/>
           </w:tcPr>
           <w:p>
+            <w:pPr>
+              <w:rPr>
+                <w:b/>
+                <w:bCs/>
+              </w:rPr>
+            </w:pPr>
             <w:r>
-              <w:t>Banco relacional em arquivo local sob controle exclusivo da API.</w:t>
+              <w:rPr>
+                <w:b/>
+                <w:bCs/>
+              </w:rPr>
+              <w:t>Banco relacional em arquivo local, gerenciado exclusivamente pela API.</w:t>
             </w:r>
           </w:p>
         </w:tc>
@@ -840,6 +1077,12 @@
             <w:hideMark/>
           </w:tcPr>
           <w:p>
+            <w:pPr>
+              <w:rPr>
+                <w:b/>
+                <w:bCs/>
+              </w:rPr>
+            </w:pPr>
             <w:r>
               <w:rPr>
                 <w:b/>
@@ -868,8 +1111,18 @@
             <w:hideMark/>
           </w:tcPr>
           <w:p>
+            <w:pPr>
+              <w:rPr>
+                <w:b/>
+                <w:bCs/>
+              </w:rPr>
+            </w:pPr>
             <w:r>
-              <w:t>System.Net.Http.HttpClient</w:t>
+              <w:rPr>
+                <w:b/>
+                <w:bCs/>
+              </w:rPr>
+              <w:t>Axios / Fetch API</w:t>
             </w:r>
           </w:p>
         </w:tc>
@@ -892,8 +1145,18 @@
             <w:hideMark/>
           </w:tcPr>
           <w:p>
+            <w:pPr>
+              <w:rPr>
+                <w:b/>
+                <w:bCs/>
+              </w:rPr>
+            </w:pPr>
             <w:r>
-              <w:t>Cliente assíncrono no WPF para consumo do Backend.</w:t>
+              <w:rPr>
+                <w:b/>
+                <w:bCs/>
+              </w:rPr>
+              <w:t>Cliente HTTP assíncrono no navegador para consumo dos endpoints da Web API.</w:t>
             </w:r>
           </w:p>
         </w:tc>
@@ -915,159 +1178,380 @@
       </w:r>
     </w:p>
     <w:p>
-      <w:r>
-        <w:t xml:space="preserve">O modelo adota o relacionamento </w:t>
-      </w:r>
-      <w:r>
-        <w:rPr>
-          <w:b/>
-          <w:bCs/>
-        </w:rPr>
-        <w:t>1 para Muitos (1-to-N)</w:t>
-      </w:r>
-      <w:r>
-        <w:t xml:space="preserve"> entre Catálogo e Estoque Físico:</w:t>
+      <w:pPr>
+        <w:rPr>
+          <w:b/>
+          <w:bCs/>
+        </w:rPr>
+      </w:pPr>
+      <w:r>
+        <w:rPr>
+          <w:b/>
+          <w:bCs/>
+        </w:rPr>
+        <w:t>O modelo adota a estrutura de controle de acesso por usuários e o relacionamento 1 para Muitos (1-to-N) entre Catálogo e Estoque Físico:</w:t>
       </w:r>
     </w:p>
     <w:p>
       <w:pPr>
         <w:numPr>
           <w:ilvl w:val="0"/>
-          <w:numId w:val="3"/>
+          <w:numId w:val="6"/>
         </w:numPr>
-      </w:pPr>
-      <w:r>
-        <w:rPr>
-          <w:b/>
-          <w:bCs/>
-        </w:rPr>
-        <w:t>Product (Catálogo):</w:t>
+        <w:rPr>
+          <w:b/>
+          <w:bCs/>
+        </w:rPr>
+      </w:pPr>
+      <w:r>
+        <w:rPr>
+          <w:b/>
+          <w:bCs/>
+        </w:rPr>
+        <w:t>User (Autenticação e Gestão de Acesso):</w:t>
       </w:r>
     </w:p>
     <w:p>
       <w:pPr>
         <w:numPr>
           <w:ilvl w:val="1"/>
-          <w:numId w:val="3"/>
+          <w:numId w:val="6"/>
         </w:numPr>
-      </w:pPr>
-      <w:r>
-        <w:t>Id (int)</w:t>
+        <w:rPr>
+          <w:b/>
+          <w:bCs/>
+        </w:rPr>
+      </w:pPr>
+      <w:r>
+        <w:rPr>
+          <w:b/>
+          <w:bCs/>
+        </w:rPr>
+        <w:t>Id (int) — Identificador único do usuário.</w:t>
       </w:r>
     </w:p>
     <w:p>
       <w:pPr>
         <w:numPr>
           <w:ilvl w:val="1"/>
-          <w:numId w:val="3"/>
+          <w:numId w:val="6"/>
         </w:numPr>
-      </w:pPr>
-      <w:r>
-        <w:t>Name (string)</w:t>
+        <w:rPr>
+          <w:b/>
+          <w:bCs/>
+        </w:rPr>
+      </w:pPr>
+      <w:r>
+        <w:rPr>
+          <w:b/>
+          <w:bCs/>
+        </w:rPr>
+        <w:t>FullName (string) — Nome completo do usuário.</w:t>
       </w:r>
     </w:p>
     <w:p>
       <w:pPr>
         <w:numPr>
           <w:ilvl w:val="1"/>
-          <w:numId w:val="3"/>
+          <w:numId w:val="6"/>
         </w:numPr>
-      </w:pPr>
-      <w:r>
-        <w:t>Category (string)</w:t>
+        <w:rPr>
+          <w:b/>
+          <w:bCs/>
+        </w:rPr>
+      </w:pPr>
+      <w:r>
+        <w:rPr>
+          <w:b/>
+          <w:bCs/>
+        </w:rPr>
+        <w:t>Email (string) — E-mail de acesso (utilizado como login, único no sistema).</w:t>
       </w:r>
     </w:p>
     <w:p>
       <w:pPr>
         <w:numPr>
           <w:ilvl w:val="1"/>
-          <w:numId w:val="3"/>
+          <w:numId w:val="6"/>
         </w:numPr>
-      </w:pPr>
-      <w:r>
-        <w:t>WarningDaysBefore (int)</w:t>
+        <w:rPr>
+          <w:b/>
+          <w:bCs/>
+        </w:rPr>
+      </w:pPr>
+      <w:r>
+        <w:rPr>
+          <w:b/>
+          <w:bCs/>
+        </w:rPr>
+        <w:t>PasswordHash (string) — Hash da senha criptografada para segurança do acesso.</w:t>
       </w:r>
     </w:p>
     <w:p>
       <w:pPr>
         <w:numPr>
-          <w:ilvl w:val="0"/>
-          <w:numId w:val="3"/>
+          <w:ilvl w:val="1"/>
+          <w:numId w:val="6"/>
         </w:numPr>
-      </w:pPr>
-      <w:r>
-        <w:rPr>
-          <w:b/>
-          <w:bCs/>
-        </w:rPr>
-        <w:t>Batch (Lote Físico):</w:t>
+        <w:rPr>
+          <w:b/>
+          <w:bCs/>
+        </w:rPr>
+      </w:pPr>
+      <w:r>
+        <w:rPr>
+          <w:b/>
+          <w:bCs/>
+        </w:rPr>
+        <w:lastRenderedPageBreak/>
+        <w:t>Role (string) — Nível de permissão no sistema (ex: "Admin" ou "Employee").</w:t>
       </w:r>
     </w:p>
     <w:p>
       <w:pPr>
         <w:numPr>
           <w:ilvl w:val="1"/>
-          <w:numId w:val="3"/>
+          <w:numId w:val="6"/>
         </w:numPr>
-      </w:pPr>
-      <w:r>
-        <w:t>Id (int)</w:t>
+        <w:rPr>
+          <w:b/>
+          <w:bCs/>
+        </w:rPr>
+      </w:pPr>
+      <w:r>
+        <w:rPr>
+          <w:b/>
+          <w:bCs/>
+        </w:rPr>
+        <w:t>CreatedAt (DateTime) — Data e hora de criação da conta.</w:t>
       </w:r>
     </w:p>
     <w:p>
       <w:pPr>
         <w:numPr>
-          <w:ilvl w:val="1"/>
-          <w:numId w:val="3"/>
+          <w:ilvl w:val="0"/>
+          <w:numId w:val="6"/>
         </w:numPr>
-      </w:pPr>
-      <w:r>
-        <w:t>ProductId (int)</w:t>
+        <w:rPr>
+          <w:b/>
+          <w:bCs/>
+        </w:rPr>
+      </w:pPr>
+      <w:r>
+        <w:rPr>
+          <w:b/>
+          <w:bCs/>
+        </w:rPr>
+        <w:t>Product (Catálogo):</w:t>
       </w:r>
     </w:p>
     <w:p>
       <w:pPr>
         <w:numPr>
           <w:ilvl w:val="1"/>
-          <w:numId w:val="3"/>
+          <w:numId w:val="6"/>
         </w:numPr>
-      </w:pPr>
-      <w:r>
-        <w:t>Quantity (int)</w:t>
+        <w:rPr>
+          <w:b/>
+          <w:bCs/>
+        </w:rPr>
+      </w:pPr>
+      <w:r>
+        <w:rPr>
+          <w:b/>
+          <w:bCs/>
+        </w:rPr>
+        <w:t>Id (int) — Identificador único do produto.</w:t>
       </w:r>
     </w:p>
     <w:p>
       <w:pPr>
         <w:numPr>
           <w:ilvl w:val="1"/>
-          <w:numId w:val="3"/>
+          <w:numId w:val="6"/>
         </w:numPr>
-      </w:pPr>
-      <w:r>
-        <w:lastRenderedPageBreak/>
-        <w:t>ExpirationDate (DateTime / DateOnly)</w:t>
+        <w:rPr>
+          <w:b/>
+          <w:bCs/>
+        </w:rPr>
+      </w:pPr>
+      <w:r>
+        <w:rPr>
+          <w:b/>
+          <w:bCs/>
+        </w:rPr>
+        <w:t>Name (string) — Nome comercial da bebida (ex: "Heineken Long Neck 330ml").</w:t>
       </w:r>
     </w:p>
     <w:p>
       <w:pPr>
         <w:numPr>
           <w:ilvl w:val="1"/>
-          <w:numId w:val="3"/>
+          <w:numId w:val="6"/>
         </w:numPr>
-      </w:pPr>
-      <w:r>
-        <w:t>IsExpired (bool - Calculado)</w:t>
+        <w:rPr>
+          <w:b/>
+          <w:bCs/>
+        </w:rPr>
+      </w:pPr>
+      <w:r>
+        <w:rPr>
+          <w:b/>
+          <w:bCs/>
+        </w:rPr>
+        <w:t>Category (string) — Categoria do produto (ex: Cervejas, Destilados, Refrigerantes).</w:t>
       </w:r>
     </w:p>
     <w:p>
       <w:pPr>
         <w:numPr>
           <w:ilvl w:val="1"/>
-          <w:numId w:val="3"/>
+          <w:numId w:val="6"/>
         </w:numPr>
-      </w:pPr>
-      <w:r>
-        <w:t>IsExpiringSoon (bool - Calculado)</w:t>
+        <w:rPr>
+          <w:b/>
+          <w:bCs/>
+        </w:rPr>
+      </w:pPr>
+      <w:r>
+        <w:rPr>
+          <w:b/>
+          <w:bCs/>
+        </w:rPr>
+        <w:t>WarningDaysBefore (int) — Margem de antecedência em dias para disparo do alerta de validade.</w:t>
+      </w:r>
+    </w:p>
+    <w:p>
+      <w:pPr>
+        <w:numPr>
+          <w:ilvl w:val="0"/>
+          <w:numId w:val="6"/>
+        </w:numPr>
+        <w:rPr>
+          <w:b/>
+          <w:bCs/>
+        </w:rPr>
+      </w:pPr>
+      <w:r>
+        <w:rPr>
+          <w:b/>
+          <w:bCs/>
+        </w:rPr>
+        <w:t>Batch (Lote Físico):</w:t>
+      </w:r>
+    </w:p>
+    <w:p>
+      <w:pPr>
+        <w:numPr>
+          <w:ilvl w:val="1"/>
+          <w:numId w:val="6"/>
+        </w:numPr>
+        <w:rPr>
+          <w:b/>
+          <w:bCs/>
+        </w:rPr>
+      </w:pPr>
+      <w:r>
+        <w:rPr>
+          <w:b/>
+          <w:bCs/>
+        </w:rPr>
+        <w:t>Id (int) — Identificador único do lote.</w:t>
+      </w:r>
+    </w:p>
+    <w:p>
+      <w:pPr>
+        <w:numPr>
+          <w:ilvl w:val="1"/>
+          <w:numId w:val="6"/>
+        </w:numPr>
+        <w:rPr>
+          <w:b/>
+          <w:bCs/>
+        </w:rPr>
+      </w:pPr>
+      <w:r>
+        <w:rPr>
+          <w:b/>
+          <w:bCs/>
+        </w:rPr>
+        <w:t>ProductId (int) — Chave estrangeira de ligação com a tabela Product.</w:t>
+      </w:r>
+    </w:p>
+    <w:p>
+      <w:pPr>
+        <w:numPr>
+          <w:ilvl w:val="1"/>
+          <w:numId w:val="6"/>
+        </w:numPr>
+        <w:rPr>
+          <w:b/>
+          <w:bCs/>
+        </w:rPr>
+      </w:pPr>
+      <w:r>
+        <w:rPr>
+          <w:b/>
+          <w:bCs/>
+        </w:rPr>
+        <w:t>Quantity (int) — Quantidade de unidades existentes neste lote específico.</w:t>
+      </w:r>
+    </w:p>
+    <w:p>
+      <w:pPr>
+        <w:numPr>
+          <w:ilvl w:val="1"/>
+          <w:numId w:val="6"/>
+        </w:numPr>
+        <w:rPr>
+          <w:b/>
+          <w:bCs/>
+        </w:rPr>
+      </w:pPr>
+      <w:r>
+        <w:rPr>
+          <w:b/>
+          <w:bCs/>
+        </w:rPr>
+        <w:t>ExpirationDate (DateTime / DateOnly) — Data exata de vencimento do lote.</w:t>
+      </w:r>
+    </w:p>
+    <w:p>
+      <w:pPr>
+        <w:numPr>
+          <w:ilvl w:val="1"/>
+          <w:numId w:val="6"/>
+        </w:numPr>
+        <w:rPr>
+          <w:b/>
+          <w:bCs/>
+        </w:rPr>
+      </w:pPr>
+      <w:r>
+        <w:rPr>
+          <w:b/>
+          <w:bCs/>
+        </w:rPr>
+        <w:t>IsExpired (bool - Calculado) — Propriedade lógica: indica se o lote já ultrapassou a data atual.</w:t>
+      </w:r>
+    </w:p>
+    <w:p>
+      <w:pPr>
+        <w:numPr>
+          <w:ilvl w:val="1"/>
+          <w:numId w:val="6"/>
+        </w:numPr>
+        <w:rPr>
+          <w:b/>
+          <w:bCs/>
+        </w:rPr>
+      </w:pPr>
+      <w:r>
+        <w:rPr>
+          <w:b/>
+          <w:bCs/>
+        </w:rPr>
+        <w:t>IsExpiringSoon (bool - Calculado) — Propriedade lógica: indica se a data de vencimento está dentro da janela de alerta configurada em WarningDaysBefore.</w:t>
       </w:r>
     </w:p>
     <w:p/>
@@ -1084,6 +1568,304 @@
 <file path=word/numbering.xml><?xml version="1.0" encoding="utf-8"?>
 <w:numbering xmlns:wpc="http://schemas.microsoft.com/office/word/2010/wordprocessingCanvas" xmlns:cx="http://schemas.microsoft.com/office/drawing/2014/chartex" xmlns:cx1="http://schemas.microsoft.com/office/drawing/2015/9/8/chartex" xmlns:cx2="http://schemas.microsoft.com/office/drawing/2015/10/21/chartex" xmlns:cx3="http://schemas.microsoft.com/office/drawing/2016/5/9/chartex" xmlns:cx4="http://schemas.microsoft.com/office/drawing/2016/5/10/chartex" xmlns:cx5="http://schemas.microsoft.com/office/drawing/2016/5/11/chartex" xmlns:cx6="http://schemas.microsoft.com/office/drawing/2016/5/12/chartex" xmlns:cx7="http://schemas.microsoft.com/office/drawing/2016/5/13/chartex" xmlns:cx8="http://schemas.microsoft.com/office/drawing/2016/5/14/chartex" xmlns:mc="http://schemas.openxmlformats.org/markup-compatibility/2006" xmlns:aink="http://schemas.microsoft.com/office/drawing/2016/ink" xmlns:am3d="http://schemas.microsoft.com/office/drawing/2017/model3d" xmlns:o="urn:schemas-microsoft-com:office:office" xmlns:oel="http://schemas.microsoft.com/office/2019/extlst" xmlns:r="http://schemas.openxmlformats.org/officeDocument/2006/relationships" xmlns:m="http://schemas.openxmlformats.org/officeDocument/2006/math" xmlns:v="urn:schemas-microsoft-com:vml" xmlns:wp14="http://schemas.microsoft.com/office/word/2010/wordprocessingDrawing" xmlns:wp="http://schemas.openxmlformats.org/drawingml/2006/wordprocessingDrawing" xmlns:w10="urn:schemas-microsoft-com:office:word" xmlns:w="http://schemas.openxmlformats.org/wordprocessingml/2006/main" xmlns:w14="http://schemas.microsoft.com/office/word/2010/wordml" xmlns:w15="http://schemas.microsoft.com/office/word/2012/wordml" xmlns:w16cex="http://schemas.microsoft.com/office/word/2018/wordml/cex" xmlns:w16cid="http://schemas.microsoft.com/office/word/2016/wordml/cid" xmlns:w16="http://schemas.microsoft.com/office/word/2018/wordml" xmlns:w16du="http://schemas.microsoft.com/office/word/2023/wordml/word16du" xmlns:w16sdtdh="http://schemas.microsoft.com/office/word/2020/wordml/sdtdatahash" xmlns:w16sdtfl="http://schemas.microsoft.com/office/word/2024/wordml/sdtformatlock" xmlns:w16se="http://schemas.microsoft.com/office/word/2015/wordml/symex" xmlns:wpg="http://schemas.microsoft.com/office/word/2010/wordprocessingGroup" xmlns:wpi="http://schemas.microsoft.com/office/word/2010/wordprocessingInk" xmlns:wne="http://schemas.microsoft.com/office/word/2006/wordml" xmlns:wps="http://schemas.microsoft.com/office/word/2010/wordprocessingShape" mc:Ignorable="w14 w15 w16se w16cid w16 w16cex w16sdtdh w16sdtfl w16du wp14">
   <w:abstractNum w:abstractNumId="0" w15:restartNumberingAfterBreak="0">
+    <w:nsid w:val="24AF1234"/>
+    <w:multiLevelType w:val="multilevel"/>
+    <w:tmpl w:val="F880CE4A"/>
+    <w:lvl w:ilvl="0">
+      <w:start w:val="1"/>
+      <w:numFmt w:val="bullet"/>
+      <w:lvlText w:val=""/>
+      <w:lvlJc w:val="left"/>
+      <w:pPr>
+        <w:tabs>
+          <w:tab w:val="num" w:pos="720"/>
+        </w:tabs>
+        <w:ind w:left="720" w:hanging="360"/>
+      </w:pPr>
+      <w:rPr>
+        <w:rFonts w:ascii="Symbol" w:hAnsi="Symbol" w:hint="default"/>
+        <w:sz w:val="20"/>
+      </w:rPr>
+    </w:lvl>
+    <w:lvl w:ilvl="1" w:tentative="1">
+      <w:start w:val="1"/>
+      <w:numFmt w:val="bullet"/>
+      <w:lvlText w:val="o"/>
+      <w:lvlJc w:val="left"/>
+      <w:pPr>
+        <w:tabs>
+          <w:tab w:val="num" w:pos="1440"/>
+        </w:tabs>
+        <w:ind w:left="1440" w:hanging="360"/>
+      </w:pPr>
+      <w:rPr>
+        <w:rFonts w:ascii="Courier New" w:hAnsi="Courier New" w:hint="default"/>
+        <w:sz w:val="20"/>
+      </w:rPr>
+    </w:lvl>
+    <w:lvl w:ilvl="2" w:tentative="1">
+      <w:start w:val="1"/>
+      <w:numFmt w:val="bullet"/>
+      <w:lvlText w:val=""/>
+      <w:lvlJc w:val="left"/>
+      <w:pPr>
+        <w:tabs>
+          <w:tab w:val="num" w:pos="2160"/>
+        </w:tabs>
+        <w:ind w:left="2160" w:hanging="360"/>
+      </w:pPr>
+      <w:rPr>
+        <w:rFonts w:ascii="Wingdings" w:hAnsi="Wingdings" w:hint="default"/>
+        <w:sz w:val="20"/>
+      </w:rPr>
+    </w:lvl>
+    <w:lvl w:ilvl="3" w:tentative="1">
+      <w:start w:val="1"/>
+      <w:numFmt w:val="bullet"/>
+      <w:lvlText w:val=""/>
+      <w:lvlJc w:val="left"/>
+      <w:pPr>
+        <w:tabs>
+          <w:tab w:val="num" w:pos="2880"/>
+        </w:tabs>
+        <w:ind w:left="2880" w:hanging="360"/>
+      </w:pPr>
+      <w:rPr>
+        <w:rFonts w:ascii="Wingdings" w:hAnsi="Wingdings" w:hint="default"/>
+        <w:sz w:val="20"/>
+      </w:rPr>
+    </w:lvl>
+    <w:lvl w:ilvl="4" w:tentative="1">
+      <w:start w:val="1"/>
+      <w:numFmt w:val="bullet"/>
+      <w:lvlText w:val=""/>
+      <w:lvlJc w:val="left"/>
+      <w:pPr>
+        <w:tabs>
+          <w:tab w:val="num" w:pos="3600"/>
+        </w:tabs>
+        <w:ind w:left="3600" w:hanging="360"/>
+      </w:pPr>
+      <w:rPr>
+        <w:rFonts w:ascii="Wingdings" w:hAnsi="Wingdings" w:hint="default"/>
+        <w:sz w:val="20"/>
+      </w:rPr>
+    </w:lvl>
+    <w:lvl w:ilvl="5" w:tentative="1">
+      <w:start w:val="1"/>
+      <w:numFmt w:val="bullet"/>
+      <w:lvlText w:val=""/>
+      <w:lvlJc w:val="left"/>
+      <w:pPr>
+        <w:tabs>
+          <w:tab w:val="num" w:pos="4320"/>
+        </w:tabs>
+        <w:ind w:left="4320" w:hanging="360"/>
+      </w:pPr>
+      <w:rPr>
+        <w:rFonts w:ascii="Wingdings" w:hAnsi="Wingdings" w:hint="default"/>
+        <w:sz w:val="20"/>
+      </w:rPr>
+    </w:lvl>
+    <w:lvl w:ilvl="6" w:tentative="1">
+      <w:start w:val="1"/>
+      <w:numFmt w:val="bullet"/>
+      <w:lvlText w:val=""/>
+      <w:lvlJc w:val="left"/>
+      <w:pPr>
+        <w:tabs>
+          <w:tab w:val="num" w:pos="5040"/>
+        </w:tabs>
+        <w:ind w:left="5040" w:hanging="360"/>
+      </w:pPr>
+      <w:rPr>
+        <w:rFonts w:ascii="Wingdings" w:hAnsi="Wingdings" w:hint="default"/>
+        <w:sz w:val="20"/>
+      </w:rPr>
+    </w:lvl>
+    <w:lvl w:ilvl="7" w:tentative="1">
+      <w:start w:val="1"/>
+      <w:numFmt w:val="bullet"/>
+      <w:lvlText w:val=""/>
+      <w:lvlJc w:val="left"/>
+      <w:pPr>
+        <w:tabs>
+          <w:tab w:val="num" w:pos="5760"/>
+        </w:tabs>
+        <w:ind w:left="5760" w:hanging="360"/>
+      </w:pPr>
+      <w:rPr>
+        <w:rFonts w:ascii="Wingdings" w:hAnsi="Wingdings" w:hint="default"/>
+        <w:sz w:val="20"/>
+      </w:rPr>
+    </w:lvl>
+    <w:lvl w:ilvl="8" w:tentative="1">
+      <w:start w:val="1"/>
+      <w:numFmt w:val="bullet"/>
+      <w:lvlText w:val=""/>
+      <w:lvlJc w:val="left"/>
+      <w:pPr>
+        <w:tabs>
+          <w:tab w:val="num" w:pos="6480"/>
+        </w:tabs>
+        <w:ind w:left="6480" w:hanging="360"/>
+      </w:pPr>
+      <w:rPr>
+        <w:rFonts w:ascii="Wingdings" w:hAnsi="Wingdings" w:hint="default"/>
+        <w:sz w:val="20"/>
+      </w:rPr>
+    </w:lvl>
+  </w:abstractNum>
+  <w:abstractNum w:abstractNumId="1" w15:restartNumberingAfterBreak="0">
+    <w:nsid w:val="2838312D"/>
+    <w:multiLevelType w:val="multilevel"/>
+    <w:tmpl w:val="886C08D6"/>
+    <w:lvl w:ilvl="0">
+      <w:start w:val="1"/>
+      <w:numFmt w:val="bullet"/>
+      <w:lvlText w:val=""/>
+      <w:lvlJc w:val="left"/>
+      <w:pPr>
+        <w:tabs>
+          <w:tab w:val="num" w:pos="720"/>
+        </w:tabs>
+        <w:ind w:left="720" w:hanging="360"/>
+      </w:pPr>
+      <w:rPr>
+        <w:rFonts w:ascii="Symbol" w:hAnsi="Symbol" w:hint="default"/>
+        <w:sz w:val="20"/>
+      </w:rPr>
+    </w:lvl>
+    <w:lvl w:ilvl="1">
+      <w:start w:val="1"/>
+      <w:numFmt w:val="bullet"/>
+      <w:lvlText w:val="o"/>
+      <w:lvlJc w:val="left"/>
+      <w:pPr>
+        <w:tabs>
+          <w:tab w:val="num" w:pos="1440"/>
+        </w:tabs>
+        <w:ind w:left="1440" w:hanging="360"/>
+      </w:pPr>
+      <w:rPr>
+        <w:rFonts w:ascii="Courier New" w:hAnsi="Courier New" w:hint="default"/>
+        <w:sz w:val="20"/>
+      </w:rPr>
+    </w:lvl>
+    <w:lvl w:ilvl="2" w:tentative="1">
+      <w:start w:val="1"/>
+      <w:numFmt w:val="bullet"/>
+      <w:lvlText w:val=""/>
+      <w:lvlJc w:val="left"/>
+      <w:pPr>
+        <w:tabs>
+          <w:tab w:val="num" w:pos="2160"/>
+        </w:tabs>
+        <w:ind w:left="2160" w:hanging="360"/>
+      </w:pPr>
+      <w:rPr>
+        <w:rFonts w:ascii="Wingdings" w:hAnsi="Wingdings" w:hint="default"/>
+        <w:sz w:val="20"/>
+      </w:rPr>
+    </w:lvl>
+    <w:lvl w:ilvl="3" w:tentative="1">
+      <w:start w:val="1"/>
+      <w:numFmt w:val="bullet"/>
+      <w:lvlText w:val=""/>
+      <w:lvlJc w:val="left"/>
+      <w:pPr>
+        <w:tabs>
+          <w:tab w:val="num" w:pos="2880"/>
+        </w:tabs>
+        <w:ind w:left="2880" w:hanging="360"/>
+      </w:pPr>
+      <w:rPr>
+        <w:rFonts w:ascii="Wingdings" w:hAnsi="Wingdings" w:hint="default"/>
+        <w:sz w:val="20"/>
+      </w:rPr>
+    </w:lvl>
+    <w:lvl w:ilvl="4" w:tentative="1">
+      <w:start w:val="1"/>
+      <w:numFmt w:val="bullet"/>
+      <w:lvlText w:val=""/>
+      <w:lvlJc w:val="left"/>
+      <w:pPr>
+        <w:tabs>
+          <w:tab w:val="num" w:pos="3600"/>
+        </w:tabs>
+        <w:ind w:left="3600" w:hanging="360"/>
+      </w:pPr>
+      <w:rPr>
+        <w:rFonts w:ascii="Wingdings" w:hAnsi="Wingdings" w:hint="default"/>
+        <w:sz w:val="20"/>
+      </w:rPr>
+    </w:lvl>
+    <w:lvl w:ilvl="5" w:tentative="1">
+      <w:start w:val="1"/>
+      <w:numFmt w:val="bullet"/>
+      <w:lvlText w:val=""/>
+      <w:lvlJc w:val="left"/>
+      <w:pPr>
+        <w:tabs>
+          <w:tab w:val="num" w:pos="4320"/>
+        </w:tabs>
+        <w:ind w:left="4320" w:hanging="360"/>
+      </w:pPr>
+      <w:rPr>
+        <w:rFonts w:ascii="Wingdings" w:hAnsi="Wingdings" w:hint="default"/>
+        <w:sz w:val="20"/>
+      </w:rPr>
+    </w:lvl>
+    <w:lvl w:ilvl="6" w:tentative="1">
+      <w:start w:val="1"/>
+      <w:numFmt w:val="bullet"/>
+      <w:lvlText w:val=""/>
+      <w:lvlJc w:val="left"/>
+      <w:pPr>
+        <w:tabs>
+          <w:tab w:val="num" w:pos="5040"/>
+        </w:tabs>
+        <w:ind w:left="5040" w:hanging="360"/>
+      </w:pPr>
+      <w:rPr>
+        <w:rFonts w:ascii="Wingdings" w:hAnsi="Wingdings" w:hint="default"/>
+        <w:sz w:val="20"/>
+      </w:rPr>
+    </w:lvl>
+    <w:lvl w:ilvl="7" w:tentative="1">
+      <w:start w:val="1"/>
+      <w:numFmt w:val="bullet"/>
+      <w:lvlText w:val=""/>
+      <w:lvlJc w:val="left"/>
+      <w:pPr>
+        <w:tabs>
+          <w:tab w:val="num" w:pos="5760"/>
+        </w:tabs>
+        <w:ind w:left="5760" w:hanging="360"/>
+      </w:pPr>
+      <w:rPr>
+        <w:rFonts w:ascii="Wingdings" w:hAnsi="Wingdings" w:hint="default"/>
+        <w:sz w:val="20"/>
+      </w:rPr>
+    </w:lvl>
+    <w:lvl w:ilvl="8" w:tentative="1">
+      <w:start w:val="1"/>
+      <w:numFmt w:val="bullet"/>
+      <w:lvlText w:val=""/>
+      <w:lvlJc w:val="left"/>
+      <w:pPr>
+        <w:tabs>
+          <w:tab w:val="num" w:pos="6480"/>
+        </w:tabs>
+        <w:ind w:left="6480" w:hanging="360"/>
+      </w:pPr>
+      <w:rPr>
+        <w:rFonts w:ascii="Wingdings" w:hAnsi="Wingdings" w:hint="default"/>
+        <w:sz w:val="20"/>
+      </w:rPr>
+    </w:lvl>
+  </w:abstractNum>
+  <w:abstractNum w:abstractNumId="2" w15:restartNumberingAfterBreak="0">
     <w:nsid w:val="645D19BE"/>
     <w:multiLevelType w:val="multilevel"/>
     <w:tmpl w:val="8D14B39E"/>
@@ -1232,7 +2014,7 @@
       </w:rPr>
     </w:lvl>
   </w:abstractNum>
-  <w:abstractNum w:abstractNumId="1" w15:restartNumberingAfterBreak="0">
+  <w:abstractNum w:abstractNumId="3" w15:restartNumberingAfterBreak="0">
     <w:nsid w:val="650539B3"/>
     <w:multiLevelType w:val="multilevel"/>
     <w:tmpl w:val="89C27FCE"/>
@@ -1381,7 +2163,156 @@
       </w:rPr>
     </w:lvl>
   </w:abstractNum>
-  <w:abstractNum w:abstractNumId="2" w15:restartNumberingAfterBreak="0">
+  <w:abstractNum w:abstractNumId="4" w15:restartNumberingAfterBreak="0">
+    <w:nsid w:val="7A485EE8"/>
+    <w:multiLevelType w:val="multilevel"/>
+    <w:tmpl w:val="4894D334"/>
+    <w:lvl w:ilvl="0">
+      <w:start w:val="1"/>
+      <w:numFmt w:val="bullet"/>
+      <w:lvlText w:val=""/>
+      <w:lvlJc w:val="left"/>
+      <w:pPr>
+        <w:tabs>
+          <w:tab w:val="num" w:pos="720"/>
+        </w:tabs>
+        <w:ind w:left="720" w:hanging="360"/>
+      </w:pPr>
+      <w:rPr>
+        <w:rFonts w:ascii="Symbol" w:hAnsi="Symbol" w:hint="default"/>
+        <w:sz w:val="20"/>
+      </w:rPr>
+    </w:lvl>
+    <w:lvl w:ilvl="1" w:tentative="1">
+      <w:start w:val="1"/>
+      <w:numFmt w:val="bullet"/>
+      <w:lvlText w:val="o"/>
+      <w:lvlJc w:val="left"/>
+      <w:pPr>
+        <w:tabs>
+          <w:tab w:val="num" w:pos="1440"/>
+        </w:tabs>
+        <w:ind w:left="1440" w:hanging="360"/>
+      </w:pPr>
+      <w:rPr>
+        <w:rFonts w:ascii="Courier New" w:hAnsi="Courier New" w:hint="default"/>
+        <w:sz w:val="20"/>
+      </w:rPr>
+    </w:lvl>
+    <w:lvl w:ilvl="2" w:tentative="1">
+      <w:start w:val="1"/>
+      <w:numFmt w:val="bullet"/>
+      <w:lvlText w:val=""/>
+      <w:lvlJc w:val="left"/>
+      <w:pPr>
+        <w:tabs>
+          <w:tab w:val="num" w:pos="2160"/>
+        </w:tabs>
+        <w:ind w:left="2160" w:hanging="360"/>
+      </w:pPr>
+      <w:rPr>
+        <w:rFonts w:ascii="Wingdings" w:hAnsi="Wingdings" w:hint="default"/>
+        <w:sz w:val="20"/>
+      </w:rPr>
+    </w:lvl>
+    <w:lvl w:ilvl="3" w:tentative="1">
+      <w:start w:val="1"/>
+      <w:numFmt w:val="bullet"/>
+      <w:lvlText w:val=""/>
+      <w:lvlJc w:val="left"/>
+      <w:pPr>
+        <w:tabs>
+          <w:tab w:val="num" w:pos="2880"/>
+        </w:tabs>
+        <w:ind w:left="2880" w:hanging="360"/>
+      </w:pPr>
+      <w:rPr>
+        <w:rFonts w:ascii="Wingdings" w:hAnsi="Wingdings" w:hint="default"/>
+        <w:sz w:val="20"/>
+      </w:rPr>
+    </w:lvl>
+    <w:lvl w:ilvl="4" w:tentative="1">
+      <w:start w:val="1"/>
+      <w:numFmt w:val="bullet"/>
+      <w:lvlText w:val=""/>
+      <w:lvlJc w:val="left"/>
+      <w:pPr>
+        <w:tabs>
+          <w:tab w:val="num" w:pos="3600"/>
+        </w:tabs>
+        <w:ind w:left="3600" w:hanging="360"/>
+      </w:pPr>
+      <w:rPr>
+        <w:rFonts w:ascii="Wingdings" w:hAnsi="Wingdings" w:hint="default"/>
+        <w:sz w:val="20"/>
+      </w:rPr>
+    </w:lvl>
+    <w:lvl w:ilvl="5" w:tentative="1">
+      <w:start w:val="1"/>
+      <w:numFmt w:val="bullet"/>
+      <w:lvlText w:val=""/>
+      <w:lvlJc w:val="left"/>
+      <w:pPr>
+        <w:tabs>
+          <w:tab w:val="num" w:pos="4320"/>
+        </w:tabs>
+        <w:ind w:left="4320" w:hanging="360"/>
+      </w:pPr>
+      <w:rPr>
+        <w:rFonts w:ascii="Wingdings" w:hAnsi="Wingdings" w:hint="default"/>
+        <w:sz w:val="20"/>
+      </w:rPr>
+    </w:lvl>
+    <w:lvl w:ilvl="6" w:tentative="1">
+      <w:start w:val="1"/>
+      <w:numFmt w:val="bullet"/>
+      <w:lvlText w:val=""/>
+      <w:lvlJc w:val="left"/>
+      <w:pPr>
+        <w:tabs>
+          <w:tab w:val="num" w:pos="5040"/>
+        </w:tabs>
+        <w:ind w:left="5040" w:hanging="360"/>
+      </w:pPr>
+      <w:rPr>
+        <w:rFonts w:ascii="Wingdings" w:hAnsi="Wingdings" w:hint="default"/>
+        <w:sz w:val="20"/>
+      </w:rPr>
+    </w:lvl>
+    <w:lvl w:ilvl="7" w:tentative="1">
+      <w:start w:val="1"/>
+      <w:numFmt w:val="bullet"/>
+      <w:lvlText w:val=""/>
+      <w:lvlJc w:val="left"/>
+      <w:pPr>
+        <w:tabs>
+          <w:tab w:val="num" w:pos="5760"/>
+        </w:tabs>
+        <w:ind w:left="5760" w:hanging="360"/>
+      </w:pPr>
+      <w:rPr>
+        <w:rFonts w:ascii="Wingdings" w:hAnsi="Wingdings" w:hint="default"/>
+        <w:sz w:val="20"/>
+      </w:rPr>
+    </w:lvl>
+    <w:lvl w:ilvl="8" w:tentative="1">
+      <w:start w:val="1"/>
+      <w:numFmt w:val="bullet"/>
+      <w:lvlText w:val=""/>
+      <w:lvlJc w:val="left"/>
+      <w:pPr>
+        <w:tabs>
+          <w:tab w:val="num" w:pos="6480"/>
+        </w:tabs>
+        <w:ind w:left="6480" w:hanging="360"/>
+      </w:pPr>
+      <w:rPr>
+        <w:rFonts w:ascii="Wingdings" w:hAnsi="Wingdings" w:hint="default"/>
+        <w:sz w:val="20"/>
+      </w:rPr>
+    </w:lvl>
+  </w:abstractNum>
+  <w:abstractNum w:abstractNumId="5" w15:restartNumberingAfterBreak="0">
     <w:nsid w:val="7DA15F76"/>
     <w:multiLevelType w:val="multilevel"/>
     <w:tmpl w:val="E8F6E520"/>
@@ -1531,12 +2462,21 @@
     </w:lvl>
   </w:abstractNum>
   <w:num w:numId="1" w16cid:durableId="863637354">
+    <w:abstractNumId w:val="2"/>
+  </w:num>
+  <w:num w:numId="2" w16cid:durableId="1478035202">
+    <w:abstractNumId w:val="5"/>
+  </w:num>
+  <w:num w:numId="3" w16cid:durableId="1196890919">
+    <w:abstractNumId w:val="3"/>
+  </w:num>
+  <w:num w:numId="4" w16cid:durableId="1122991642">
     <w:abstractNumId w:val="0"/>
   </w:num>
-  <w:num w:numId="2" w16cid:durableId="1478035202">
-    <w:abstractNumId w:val="2"/>
+  <w:num w:numId="5" w16cid:durableId="2049639267">
+    <w:abstractNumId w:val="4"/>
   </w:num>
-  <w:num w:numId="3" w16cid:durableId="1196890919">
+  <w:num w:numId="6" w16cid:durableId="950353573">
     <w:abstractNumId w:val="1"/>
   </w:num>
 </w:numbering>

</xml_diff>